<commit_message>
описаны поля production_date и expire_date
</commit_message>
<xml_diff>
--- a/АПТЕКА ДОКУМЕНТ.docx
+++ b/АПТЕКА ДОКУМЕНТ.docx
@@ -4606,6 +4606,7 @@
               </w:rPr>
               <w:t>_</w:t>
             </w:r>
+            <w:proofErr w:type="spellStart"/>
             <w:r>
               <w:rPr>
                 <w:rFonts w:ascii="Times New Roman" w:eastAsia="Times New Roman" w:hAnsi="Times New Roman" w:cs="Times New Roman"/>
@@ -4614,8 +4615,7 @@
               </w:rPr>
               <w:t>tin</w:t>
             </w:r>
-            <w:bookmarkStart w:id="0" w:name="_GoBack"/>
-            <w:bookmarkEnd w:id="0"/>
+            <w:proofErr w:type="spellEnd"/>
           </w:p>
         </w:tc>
         <w:tc>
@@ -5084,11 +5084,35 @@
     </w:tbl>
     <w:p>
       <w:pPr>
+        <w:spacing w:before="240" w:after="0" w:line="360" w:lineRule="auto"/>
+        <w:ind w:firstLine="709"/>
+        <w:jc w:val="both"/>
+        <w:rPr>
+          <w:rFonts w:ascii="Times New Roman" w:eastAsia="Times New Roman" w:hAnsi="Times New Roman" w:cs="Times New Roman"/>
+          <w:sz w:val="28"/>
+          <w:szCs w:val="28"/>
+          <w:lang w:val="ru-RU"/>
+        </w:rPr>
+      </w:pPr>
+      <w:r>
+        <w:rPr>
+          <w:rFonts w:ascii="Times New Roman" w:eastAsia="Times New Roman" w:hAnsi="Times New Roman" w:cs="Times New Roman"/>
+          <w:sz w:val="28"/>
+          <w:szCs w:val="28"/>
+          <w:lang w:val="ru-RU"/>
+        </w:rPr>
+        <w:t>Даты производства и срока годности необходимы для вычисления просроченных товаров.</w:t>
+      </w:r>
+      <w:bookmarkStart w:id="0" w:name="_GoBack"/>
+      <w:bookmarkEnd w:id="0"/>
+    </w:p>
+    <w:p>
+      <w:pPr>
         <w:numPr>
           <w:ilvl w:val="0"/>
           <w:numId w:val="1"/>
         </w:numPr>
-        <w:spacing w:before="240" w:after="0" w:line="360" w:lineRule="auto"/>
+        <w:spacing w:before="120" w:after="0" w:line="360" w:lineRule="auto"/>
         <w:jc w:val="both"/>
         <w:rPr>
           <w:rFonts w:ascii="Times New Roman" w:eastAsia="Times New Roman" w:hAnsi="Times New Roman" w:cs="Times New Roman"/>
@@ -6348,6 +6372,7 @@
                 <w:sz w:val="24"/>
                 <w:szCs w:val="24"/>
               </w:rPr>
+              <w:lastRenderedPageBreak/>
               <w:t>product_id</w:t>
             </w:r>
             <w:proofErr w:type="spellEnd"/>
@@ -6610,7 +6635,6 @@
                 <w:sz w:val="24"/>
                 <w:szCs w:val="24"/>
               </w:rPr>
-              <w:lastRenderedPageBreak/>
               <w:t>system_quantity</w:t>
             </w:r>
             <w:proofErr w:type="spellEnd"/>

</xml_diff>